<commit_message>
Se corrigen fechas de entrega en documentacion
</commit_message>
<xml_diff>
--- a/docs/Documentacion_Tecnica_Academica .docx
+++ b/docs/Documentacion_Tecnica_Academica .docx
@@ -431,7 +431,12 @@
         <w:rPr>
           <w:rtl w:val="0"/>
         </w:rPr>
-        <w:t xml:space="preserve">[Completar]</w:t>
+        <w:t xml:space="preserve">13/06/2026</w:t>
+      </w:r>
+      <w:r>
+        <w:rPr>
+          <w:rtl w:val="0"/>
+        </w:rPr>
       </w:r>
     </w:p>
     <w:p>
@@ -977,12 +982,12 @@
           <wp:inline distB="114300" distT="114300" distL="114300" distR="114300">
             <wp:extent cx="1076325" cy="371475"/>
             <wp:effectExtent b="0" l="0" r="0" t="0"/>
-            <wp:docPr id="12" name="image7.png"/>
+            <wp:docPr id="12" name="image2.png"/>
             <a:graphic>
               <a:graphicData uri="http://schemas.openxmlformats.org/drawingml/2006/picture">
                 <pic:pic>
                   <pic:nvPicPr>
-                    <pic:cNvPr id="0" name="image7.png"/>
+                    <pic:cNvPr id="0" name="image2.png"/>
                     <pic:cNvPicPr preferRelativeResize="0"/>
                   </pic:nvPicPr>
                   <pic:blipFill>
@@ -1158,12 +1163,12 @@
           <wp:inline distB="114300" distT="114300" distL="114300" distR="114300">
             <wp:extent cx="2038350" cy="1285875"/>
             <wp:effectExtent b="0" l="0" r="0" t="0"/>
-            <wp:docPr id="5" name="image13.png"/>
+            <wp:docPr id="5" name="image7.png"/>
             <a:graphic>
               <a:graphicData uri="http://schemas.openxmlformats.org/drawingml/2006/picture">
                 <pic:pic>
                   <pic:nvPicPr>
-                    <pic:cNvPr id="0" name="image13.png"/>
+                    <pic:cNvPr id="0" name="image7.png"/>
                     <pic:cNvPicPr preferRelativeResize="0"/>
                   </pic:nvPicPr>
                   <pic:blipFill>
@@ -1358,12 +1363,12 @@
           <wp:inline distB="114300" distT="114300" distL="114300" distR="114300">
             <wp:extent cx="1876425" cy="542925"/>
             <wp:effectExtent b="0" l="0" r="0" t="0"/>
-            <wp:docPr id="18" name="image8.png"/>
+            <wp:docPr id="18" name="image10.png"/>
             <a:graphic>
               <a:graphicData uri="http://schemas.openxmlformats.org/drawingml/2006/picture">
                 <pic:pic>
                   <pic:nvPicPr>
-                    <pic:cNvPr id="0" name="image8.png"/>
+                    <pic:cNvPr id="0" name="image10.png"/>
                     <pic:cNvPicPr preferRelativeResize="0"/>
                   </pic:nvPicPr>
                   <pic:blipFill>
@@ -1544,12 +1549,12 @@
           <wp:inline distB="114300" distT="114300" distL="114300" distR="114300">
             <wp:extent cx="4972050" cy="1123950"/>
             <wp:effectExtent b="0" l="0" r="0" t="0"/>
-            <wp:docPr id="3" name="image3.png"/>
+            <wp:docPr id="3" name="image13.png"/>
             <a:graphic>
               <a:graphicData uri="http://schemas.openxmlformats.org/drawingml/2006/picture">
                 <pic:pic>
                   <pic:nvPicPr>
-                    <pic:cNvPr id="0" name="image3.png"/>
+                    <pic:cNvPr id="0" name="image13.png"/>
                     <pic:cNvPicPr preferRelativeResize="0"/>
                   </pic:nvPicPr>
                   <pic:blipFill>
@@ -1734,12 +1739,12 @@
           <wp:inline distB="114300" distT="114300" distL="114300" distR="114300">
             <wp:extent cx="1495425" cy="457200"/>
             <wp:effectExtent b="0" l="0" r="0" t="0"/>
-            <wp:docPr id="16" name="image18.png"/>
+            <wp:docPr id="16" name="image12.png"/>
             <a:graphic>
               <a:graphicData uri="http://schemas.openxmlformats.org/drawingml/2006/picture">
                 <pic:pic>
                   <pic:nvPicPr>
-                    <pic:cNvPr id="0" name="image18.png"/>
+                    <pic:cNvPr id="0" name="image12.png"/>
                     <pic:cNvPicPr preferRelativeResize="0"/>
                   </pic:nvPicPr>
                   <pic:blipFill>
@@ -2966,12 +2971,12 @@
           <wp:inline distB="114300" distT="114300" distL="114300" distR="114300">
             <wp:extent cx="4624388" cy="8110783"/>
             <wp:effectExtent b="0" l="0" r="0" t="0"/>
-            <wp:docPr id="14" name="image17.png"/>
+            <wp:docPr id="14" name="image19.png"/>
             <a:graphic>
               <a:graphicData uri="http://schemas.openxmlformats.org/drawingml/2006/picture">
                 <pic:pic>
                   <pic:nvPicPr>
-                    <pic:cNvPr id="0" name="image17.png"/>
+                    <pic:cNvPr id="0" name="image19.png"/>
                     <pic:cNvPicPr preferRelativeResize="0"/>
                   </pic:nvPicPr>
                   <pic:blipFill>
@@ -3069,12 +3074,12 @@
           <wp:inline distB="114300" distT="114300" distL="114300" distR="114300">
             <wp:extent cx="3986213" cy="3536575"/>
             <wp:effectExtent b="0" l="0" r="0" t="0"/>
-            <wp:docPr id="17" name="image5.png"/>
+            <wp:docPr id="17" name="image1.png"/>
             <a:graphic>
               <a:graphicData uri="http://schemas.openxmlformats.org/drawingml/2006/picture">
                 <pic:pic>
                   <pic:nvPicPr>
-                    <pic:cNvPr id="0" name="image5.png"/>
+                    <pic:cNvPr id="0" name="image1.png"/>
                     <pic:cNvPicPr preferRelativeResize="0"/>
                   </pic:nvPicPr>
                   <pic:blipFill>
@@ -3134,12 +3139,12 @@
           <wp:inline distB="114300" distT="114300" distL="114300" distR="114300">
             <wp:extent cx="5731200" cy="3200400"/>
             <wp:effectExtent b="0" l="0" r="0" t="0"/>
-            <wp:docPr id="7" name="image14.png"/>
+            <wp:docPr id="7" name="image16.png"/>
             <a:graphic>
               <a:graphicData uri="http://schemas.openxmlformats.org/drawingml/2006/picture">
                 <pic:pic>
                   <pic:nvPicPr>
-                    <pic:cNvPr id="0" name="image14.png"/>
+                    <pic:cNvPr id="0" name="image16.png"/>
                     <pic:cNvPicPr preferRelativeResize="0"/>
                   </pic:nvPicPr>
                   <pic:blipFill>
@@ -3199,12 +3204,12 @@
           <wp:inline distB="114300" distT="114300" distL="114300" distR="114300">
             <wp:extent cx="4746567" cy="5038299"/>
             <wp:effectExtent b="0" l="0" r="0" t="0"/>
-            <wp:docPr id="15" name="image19.png"/>
+            <wp:docPr id="15" name="image20.png"/>
             <a:graphic>
               <a:graphicData uri="http://schemas.openxmlformats.org/drawingml/2006/picture">
                 <pic:pic>
                   <pic:nvPicPr>
-                    <pic:cNvPr id="0" name="image19.png"/>
+                    <pic:cNvPr id="0" name="image20.png"/>
                     <pic:cNvPicPr preferRelativeResize="0"/>
                   </pic:nvPicPr>
                   <pic:blipFill>
@@ -3264,12 +3269,12 @@
           <wp:inline distB="114300" distT="114300" distL="114300" distR="114300">
             <wp:extent cx="4876800" cy="2466975"/>
             <wp:effectExtent b="0" l="0" r="0" t="0"/>
-            <wp:docPr id="20" name="image15.png"/>
+            <wp:docPr id="20" name="image18.png"/>
             <a:graphic>
               <a:graphicData uri="http://schemas.openxmlformats.org/drawingml/2006/picture">
                 <pic:pic>
                   <pic:nvPicPr>
-                    <pic:cNvPr id="0" name="image15.png"/>
+                    <pic:cNvPr id="0" name="image18.png"/>
                     <pic:cNvPicPr preferRelativeResize="0"/>
                   </pic:nvPicPr>
                   <pic:blipFill>
@@ -3379,12 +3384,12 @@
           <wp:inline distB="114300" distT="114300" distL="114300" distR="114300">
             <wp:extent cx="5731200" cy="1193800"/>
             <wp:effectExtent b="0" l="0" r="0" t="0"/>
-            <wp:docPr id="21" name="image16.png"/>
+            <wp:docPr id="21" name="image17.png"/>
             <a:graphic>
               <a:graphicData uri="http://schemas.openxmlformats.org/drawingml/2006/picture">
                 <pic:pic>
                   <pic:nvPicPr>
-                    <pic:cNvPr id="0" name="image16.png"/>
+                    <pic:cNvPr id="0" name="image17.png"/>
                     <pic:cNvPicPr preferRelativeResize="0"/>
                   </pic:nvPicPr>
                   <pic:blipFill>
@@ -3559,12 +3564,12 @@
           <wp:inline distB="114300" distT="114300" distL="114300" distR="114300">
             <wp:extent cx="2628900" cy="752475"/>
             <wp:effectExtent b="0" l="0" r="0" t="0"/>
-            <wp:docPr id="1" name="image1.png"/>
+            <wp:docPr id="1" name="image3.png"/>
             <a:graphic>
               <a:graphicData uri="http://schemas.openxmlformats.org/drawingml/2006/picture">
                 <pic:pic>
                   <pic:nvPicPr>
-                    <pic:cNvPr id="0" name="image1.png"/>
+                    <pic:cNvPr id="0" name="image3.png"/>
                     <pic:cNvPicPr preferRelativeResize="0"/>
                   </pic:nvPicPr>
                   <pic:blipFill>
@@ -3605,12 +3610,12 @@
           <wp:inline distB="114300" distT="114300" distL="114300" distR="114300">
             <wp:extent cx="3390900" cy="828675"/>
             <wp:effectExtent b="0" l="0" r="0" t="0"/>
-            <wp:docPr id="8" name="image10.png"/>
+            <wp:docPr id="8" name="image4.png"/>
             <a:graphic>
               <a:graphicData uri="http://schemas.openxmlformats.org/drawingml/2006/picture">
                 <pic:pic>
                   <pic:nvPicPr>
-                    <pic:cNvPr id="0" name="image10.png"/>
+                    <pic:cNvPr id="0" name="image4.png"/>
                     <pic:cNvPicPr preferRelativeResize="0"/>
                   </pic:nvPicPr>
                   <pic:blipFill>
@@ -3663,12 +3668,12 @@
           <wp:inline distB="114300" distT="114300" distL="114300" distR="114300">
             <wp:extent cx="4914900" cy="1068410"/>
             <wp:effectExtent b="0" l="0" r="0" t="0"/>
-            <wp:docPr id="19" name="image6.png"/>
+            <wp:docPr id="19" name="image5.png"/>
             <a:graphic>
               <a:graphicData uri="http://schemas.openxmlformats.org/drawingml/2006/picture">
                 <pic:pic>
                   <pic:nvPicPr>
-                    <pic:cNvPr id="0" name="image6.png"/>
+                    <pic:cNvPr id="0" name="image5.png"/>
                     <pic:cNvPicPr preferRelativeResize="0"/>
                   </pic:nvPicPr>
                   <pic:blipFill>
@@ -3756,12 +3761,12 @@
           <wp:inline distB="114300" distT="114300" distL="114300" distR="114300">
             <wp:extent cx="4248150" cy="933450"/>
             <wp:effectExtent b="0" l="0" r="0" t="0"/>
-            <wp:docPr id="11" name="image9.png"/>
+            <wp:docPr id="11" name="image14.png"/>
             <a:graphic>
               <a:graphicData uri="http://schemas.openxmlformats.org/drawingml/2006/picture">
                 <pic:pic>
                   <pic:nvPicPr>
-                    <pic:cNvPr id="0" name="image9.png"/>
+                    <pic:cNvPr id="0" name="image14.png"/>
                     <pic:cNvPicPr preferRelativeResize="0"/>
                   </pic:nvPicPr>
                   <pic:blipFill>
@@ -3802,12 +3807,12 @@
           <wp:inline distB="114300" distT="114300" distL="114300" distR="114300">
             <wp:extent cx="3810000" cy="400050"/>
             <wp:effectExtent b="0" l="0" r="0" t="0"/>
-            <wp:docPr id="2" name="image11.png"/>
+            <wp:docPr id="2" name="image15.png"/>
             <a:graphic>
               <a:graphicData uri="http://schemas.openxmlformats.org/drawingml/2006/picture">
                 <pic:pic>
                   <pic:nvPicPr>
-                    <pic:cNvPr id="0" name="image11.png"/>
+                    <pic:cNvPr id="0" name="image15.png"/>
                     <pic:cNvPicPr preferRelativeResize="0"/>
                   </pic:nvPicPr>
                   <pic:blipFill>
@@ -3873,12 +3878,12 @@
           <wp:inline distB="114300" distT="114300" distL="114300" distR="114300">
             <wp:extent cx="1657350" cy="1571625"/>
             <wp:effectExtent b="0" l="0" r="0" t="0"/>
-            <wp:docPr id="9" name="image12.png"/>
+            <wp:docPr id="9" name="image8.png"/>
             <a:graphic>
               <a:graphicData uri="http://schemas.openxmlformats.org/drawingml/2006/picture">
                 <pic:pic>
                   <pic:nvPicPr>
-                    <pic:cNvPr id="0" name="image12.png"/>
+                    <pic:cNvPr id="0" name="image8.png"/>
                     <pic:cNvPicPr preferRelativeResize="0"/>
                   </pic:nvPicPr>
                   <pic:blipFill>
@@ -3908,12 +3913,12 @@
           <wp:inline distB="114300" distT="114300" distL="114300" distR="114300">
             <wp:extent cx="1619250" cy="371475"/>
             <wp:effectExtent b="0" l="0" r="0" t="0"/>
-            <wp:docPr id="10" name="image4.png"/>
+            <wp:docPr id="10" name="image6.png"/>
             <a:graphic>
               <a:graphicData uri="http://schemas.openxmlformats.org/drawingml/2006/picture">
                 <pic:pic>
                   <pic:nvPicPr>
-                    <pic:cNvPr id="0" name="image4.png"/>
+                    <pic:cNvPr id="0" name="image6.png"/>
                     <pic:cNvPicPr preferRelativeResize="0"/>
                   </pic:nvPicPr>
                   <pic:blipFill>
@@ -3954,12 +3959,12 @@
           <wp:inline distB="114300" distT="114300" distL="114300" distR="114300">
             <wp:extent cx="3636405" cy="2565562"/>
             <wp:effectExtent b="0" l="0" r="0" t="0"/>
-            <wp:docPr id="6" name="image2.png"/>
+            <wp:docPr id="6" name="image11.png"/>
             <a:graphic>
               <a:graphicData uri="http://schemas.openxmlformats.org/drawingml/2006/picture">
                 <pic:pic>
                   <pic:nvPicPr>
-                    <pic:cNvPr id="0" name="image2.png"/>
+                    <pic:cNvPr id="0" name="image11.png"/>
                     <pic:cNvPicPr preferRelativeResize="0"/>
                   </pic:nvPicPr>
                   <pic:blipFill>
@@ -4036,12 +4041,12 @@
           <wp:inline distB="114300" distT="114300" distL="114300" distR="114300">
             <wp:extent cx="3133725" cy="685800"/>
             <wp:effectExtent b="0" l="0" r="0" t="0"/>
-            <wp:docPr id="13" name="image20.png"/>
+            <wp:docPr id="13" name="image9.png"/>
             <a:graphic>
               <a:graphicData uri="http://schemas.openxmlformats.org/drawingml/2006/picture">
                 <pic:pic>
                   <pic:nvPicPr>
-                    <pic:cNvPr id="0" name="image20.png"/>
+                    <pic:cNvPr id="0" name="image9.png"/>
                     <pic:cNvPicPr preferRelativeResize="0"/>
                   </pic:nvPicPr>
                   <pic:blipFill>

</xml_diff>